<commit_message>
Heiltrank, Heilung nach dem Kampf, Heilerin mit drei vollwertigen Angriffen; DM-Konsole: Vier-Farben-Optik, Legende, Chronik eingeklappt
- Jeder Charakter hat einen Heiltrank (einmal pro Spiel): +10 HP oder wieder auf die Beine.
- Lightbearer heilt nach jedem Kampf alle gratis; ihre drei Angriffe sind so stark wie die der anderen.
- Spielerbögen: Knöpfe Trank / nach dem Kampf, Sätze zum Vorlesen, alles im Log.
- DM: Regeltexte dazu, Seitenleisten-Knopf „nach dem Kampf: alle voll“.
- DM: einheitliches Farbsystem (Gelb vorlesen, Grün an die Schüler, Grau nur du, Rot Kampf), Legende unter der Lage, Chronik als Aufklapper.
- [hidden]-Regel in beide Seiten übernommen (ausserhalb des Artifact-Gerüsts fehlte sie).
- Helfer-Blatt, Lesetexte, README, index nachgezogen.

Co-Authored-By: Claude Fable 5.1 <noreply@anthropic.com>
Claude-Session: https://claude.ai/code/session_01ADUPP2jvP6dgTYk1DsQkUN
</commit_message>
<xml_diff>
--- a/helferblatt/Nachtfels_Helfer-Blatt.docx
+++ b/helferblatt/Nachtfels_Helfer-Blatt.docx
@@ -391,6 +391,42 @@
           <w:szCs w:val="22"/>
         </w:rPr>
         <w:t xml:space="preserve">I rolled a 14.</w:t>
+      </w:r>
+    </w:p>
+    <w:p>
+      <w:pPr>
+        <w:pStyle w:val="ListParagraph"/>
+        <w:numPr>
+          <w:ilvl w:val="0"/>
+          <w:numId w:val="2"/>
+        </w:numPr>
+        <w:spacing w:after="60"/>
+      </w:pPr>
+      <w:r>
+        <w:rPr>
+          <w:rFonts w:ascii="Georgia" w:cs="Georgia" w:eastAsia="Georgia" w:hAnsi="Georgia"/>
+          <w:sz w:val="22"/>
+          <w:szCs w:val="22"/>
+        </w:rPr>
+        <w:t xml:space="preserve">I drink my potion!</w:t>
+      </w:r>
+    </w:p>
+    <w:p>
+      <w:pPr>
+        <w:pStyle w:val="ListParagraph"/>
+        <w:numPr>
+          <w:ilvl w:val="0"/>
+          <w:numId w:val="2"/>
+        </w:numPr>
+        <w:spacing w:after="60"/>
+      </w:pPr>
+      <w:r>
+        <w:rPr>
+          <w:rFonts w:ascii="Georgia" w:cs="Georgia" w:eastAsia="Georgia" w:hAnsi="Georgia"/>
+          <w:sz w:val="22"/>
+          <w:szCs w:val="22"/>
+        </w:rPr>
+        <w:t xml:space="preserve">The fight is over — I heal everyone.</w:t>
       </w:r>
     </w:p>
     <w:p>

</xml_diff>

<commit_message>
Konsole überarbeitet: Rahmen, Uhr, Notstopper, Rückgängig, Gewinnchance
Elf Seiten statt dreizehn: The Courtyard trägt jetzt die Türwahl, Six O’Clock
den Schluss. Leiste und Gefahrenbalken bilden einen Rahmen aus einem Stück.
Neue Unterrichtsuhr (90 Minuten, pausierbar, Soll je Seite), Übergang „Zeit
knapp“ je Seite und der Notstopper (der Graf kommt selbst, drei Ausgänge).
Rückgängig für den letzten Spielschritt (Strg+Z). Im Kampfbildschirm die
Gewinnchance für die aktuellen Gegner statt der Erklärung zum freien Kampf.
Anleitung gekürzt, Personenkarten mit abhakbaren Antworten und „Notfalls“,
Festhalten für Tams Bitte, Wortstützen je Seite, Helfer-Blatt ohne Hinweise.
Prüfstand auf Titel umgestellt, prüft Uhr, Rückgängig und Notstopper mit;
1800 Pfade in V2, V1 unverändert grün. README, Spickzettel und Index angepasst.

Co-Authored-By: Claude Fable 5.1 <noreply@anthropic.com>
Claude-Session: https://claude.ai/code/session_01ADUPP2jvP6dgTYk1DsQkUN
</commit_message>
<xml_diff>
--- a/helferblatt/Nachtfels_Helfer-Blatt.docx
+++ b/helferblatt/Nachtfels_Helfer-Blatt.docx
@@ -3052,7 +3052,7 @@
           <w:sz w:val="20"/>
           <w:szCs w:val="20"/>
         </w:rPr>
-        <w:t xml:space="preserve">The raven repeats every sentence it hears. Say one whole sentence to it — slowly and clearly.</w:t>
+        <w:t xml:space="preserve">Three doors. Each of you: which one would you choose, and why? Answer another hunter — then decide together.</w:t>
       </w:r>
     </w:p>
     <w:p>
@@ -3251,7 +3251,7 @@
                 <w:sz w:val="20"/>
                 <w:szCs w:val="20"/>
               </w:rPr>
-              <w:t xml:space="preserve">a raven</w:t>
+              <w:t xml:space="preserve">to choose</w:t>
             </w:r>
           </w:p>
         </w:tc>
@@ -3275,7 +3275,57 @@
                 <w:sz w:val="20"/>
                 <w:szCs w:val="20"/>
               </w:rPr>
-              <w:t xml:space="preserve">ein Rabe</w:t>
+              <w:t xml:space="preserve">wählen</w:t>
+            </w:r>
+          </w:p>
+        </w:tc>
+      </w:tr>
+      <w:tr>
+        <w:tc>
+          <w:tcPr>
+            <w:tcW w:type="dxa" w:w="5100"/>
+            <w:tcMar>
+              <w:top w:type="dxa" w:w="50"/>
+              <w:left w:type="dxa" w:w="110"/>
+              <w:bottom w:type="dxa" w:w="50"/>
+              <w:right w:type="dxa" w:w="110"/>
+            </w:tcMar>
+          </w:tcPr>
+          <w:p>
+            <w:r>
+              <w:rPr>
+                <w:rFonts w:ascii="Georgia" w:cs="Georgia" w:eastAsia="Georgia" w:hAnsi="Georgia"/>
+                <w:b/>
+                <w:bCs/>
+                <w:color w:val="1A1A1A"/>
+                <w:sz w:val="20"/>
+                <w:szCs w:val="20"/>
+              </w:rPr>
+              <w:t xml:space="preserve">to explore</w:t>
+            </w:r>
+          </w:p>
+        </w:tc>
+        <w:tc>
+          <w:tcPr>
+            <w:tcW w:type="dxa" w:w="4538"/>
+            <w:tcMar>
+              <w:top w:type="dxa" w:w="50"/>
+              <w:left w:type="dxa" w:w="110"/>
+              <w:bottom w:type="dxa" w:w="50"/>
+              <w:right w:type="dxa" w:w="110"/>
+            </w:tcMar>
+          </w:tcPr>
+          <w:p>
+            <w:r>
+              <w:rPr>
+                <w:rFonts w:ascii="Georgia" w:cs="Georgia" w:eastAsia="Georgia" w:hAnsi="Georgia"/>
+                <w:b w:val="false"/>
+                <w:bCs w:val="false"/>
+                <w:color w:val="444444"/>
+                <w:sz w:val="20"/>
+                <w:szCs w:val="20"/>
+              </w:rPr>
+              <w:t xml:space="preserve">erkunden</w:t>
             </w:r>
           </w:p>
         </w:tc>

</xml_diff>

<commit_message>
2d6 überall, Sumpf mit einem Wurf pro Figur, Gefahr-Schublade an der Säule
Spielerblätter würfeln zwei Sechser statt W20: Zielzahlen 6/7/8 halten die
alten Trefferchancen, Sechserpasch ist kritisch, grosse Angriffe 3d6+7.
Schicksal: Sechserpasch/Einerpasch. kampf_sim.py und die Gewinnchance der
Konsole rechnen ebenso; drei Vampire Spawn bleiben bei 50 %.
Sumpf: jede Figur würfelt einmal, wer feststeckt, ruft auf Englisch um Hilfe.
Gefahr wird über eine ausklappbare Lasche an der Säule verstellt (aus dem
Rahmentest), mit den drei Stufen; die Knöpfe sind aus der Leiste raus.

Co-Authored-By: Claude Opus 5.5 <noreply@anthropic.com>
Claude-Session: https://claude.ai/code/session_01ADUPP2jvP6dgTYk1DsQkUN
</commit_message>
<xml_diff>
--- a/helferblatt/Nachtfels_Helfer-Blatt.docx
+++ b/helferblatt/Nachtfels_Helfer-Blatt.docx
@@ -2461,7 +2461,7 @@
           <w:sz w:val="20"/>
           <w:szCs w:val="20"/>
         </w:rPr>
-        <w:t xml:space="preserve">In the cellar: convince the guard that you are guests — one calm sentence each. In the swamp: talk while you roll.</w:t>
+        <w:t xml:space="preserve">In the cellar: convince the guard that you are guests — one calm sentence each. In the swamp: one roll each — if you are stuck, call for help, and somebody explains how they pull you out.</w:t>
       </w:r>
     </w:p>
     <w:p>
@@ -2953,6 +2953,56 @@
                 <w:szCs w:val="20"/>
               </w:rPr>
               <w:t xml:space="preserve">feststecken</w:t>
+            </w:r>
+          </w:p>
+        </w:tc>
+      </w:tr>
+      <w:tr>
+        <w:tc>
+          <w:tcPr>
+            <w:tcW w:type="dxa" w:w="5100"/>
+            <w:tcMar>
+              <w:top w:type="dxa" w:w="50"/>
+              <w:left w:type="dxa" w:w="110"/>
+              <w:bottom w:type="dxa" w:w="50"/>
+              <w:right w:type="dxa" w:w="110"/>
+            </w:tcMar>
+          </w:tcPr>
+          <w:p>
+            <w:r>
+              <w:rPr>
+                <w:rFonts w:ascii="Georgia" w:cs="Georgia" w:eastAsia="Georgia" w:hAnsi="Georgia"/>
+                <w:b/>
+                <w:bCs/>
+                <w:color w:val="1A1A1A"/>
+                <w:sz w:val="20"/>
+                <w:szCs w:val="20"/>
+              </w:rPr>
+              <w:t xml:space="preserve">to pull somebody out</w:t>
+            </w:r>
+          </w:p>
+        </w:tc>
+        <w:tc>
+          <w:tcPr>
+            <w:tcW w:type="dxa" w:w="4538"/>
+            <w:tcMar>
+              <w:top w:type="dxa" w:w="50"/>
+              <w:left w:type="dxa" w:w="110"/>
+              <w:bottom w:type="dxa" w:w="50"/>
+              <w:right w:type="dxa" w:w="110"/>
+            </w:tcMar>
+          </w:tcPr>
+          <w:p>
+            <w:r>
+              <w:rPr>
+                <w:rFonts w:ascii="Georgia" w:cs="Georgia" w:eastAsia="Georgia" w:hAnsi="Georgia"/>
+                <w:b w:val="false"/>
+                <w:bCs w:val="false"/>
+                <w:color w:val="444444"/>
+                <w:sz w:val="20"/>
+                <w:szCs w:val="20"/>
+              </w:rPr>
+              <w:t xml:space="preserve">jemanden herausziehen</w:t>
             </w:r>
           </w:p>
         </w:tc>

</xml_diff>